<commit_message>
updated day 09 report
</commit_message>
<xml_diff>
--- a/reports/day-09-report.docx
+++ b/reports/day-09-report.docx
@@ -3756,14 +3756,21 @@
                 <w:sz w:val="16"/>
                 <w:szCs w:val="16"/>
               </w:rPr>
-              <w:t>11</w:t>
+              <w:t>1</w:t>
             </w:r>
             <w:r>
               <w:rPr>
                 <w:sz w:val="16"/>
                 <w:szCs w:val="16"/>
               </w:rPr>
-              <w:t xml:space="preserve"> / </w:t>
+              <w:t>3</w:t>
+            </w:r>
+            <w:r>
+              <w:rPr>
+                <w:sz w:val="16"/>
+                <w:szCs w:val="16"/>
+              </w:rPr>
+              <w:t xml:space="preserve">/ </w:t>
             </w:r>
             <w:r>
               <w:rPr>
@@ -6411,7 +6418,7 @@
                 <w:b/>
                 <w:color w:val="000000"/>
               </w:rPr>
-              <w:t>1</w:t>
+              <w:t>3</w:t>
             </w:r>
             <w:r>
               <w:rPr>
@@ -9268,6 +9275,7 @@
   <w:style w:type="character" w:default="1" w:styleId="DefaultParagraphFont">
     <w:name w:val="Default Paragraph Font"/>
     <w:uiPriority w:val="1"/>
+    <w:semiHidden/>
     <w:unhideWhenUsed/>
   </w:style>
   <w:style w:type="table" w:default="1" w:styleId="TableNormal">
@@ -10005,28 +10013,28 @@
 </file>
 
 <file path=customXml/item1.xml><?xml version="1.0" encoding="utf-8"?>
+<b:Sources xmlns:b="http://schemas.openxmlformats.org/officeDocument/2006/bibliography" xmlns="http://schemas.openxmlformats.org/officeDocument/2006/bibliography" SelectedStyle="\APASixthEditionOfficeOnline.xsl" StyleName="APA" Version="6"/>
+</file>
+
+<file path=customXml/item2.xml><?xml version="1.0" encoding="utf-8"?>
 <go:gDocsCustomXmlDataStorage xmlns:go="http://customooxmlschemas.google.com/" xmlns:r="http://schemas.openxmlformats.org/officeDocument/2006/relationships" uri="GoogleDocsCustomDataVersion2">
   <go:docsCustomData xmlns:go="http://customooxmlschemas.google.com/" roundtripDataSignature="AMtx7mgOSuG52QKgAcPqkIJvoI76VX1UzA==">CgMxLjA4AHIhMWtwZjJ6SlZCU3AwbDlvX2VIM2NYSXJlTExFM01yQ3A2</go:docsCustomData>
 </go:gDocsCustomXmlDataStorage>
 </file>
 
-<file path=customXml/item2.xml><?xml version="1.0" encoding="utf-8"?>
-<b:Sources xmlns:b="http://schemas.openxmlformats.org/officeDocument/2006/bibliography" xmlns="http://schemas.openxmlformats.org/officeDocument/2006/bibliography" SelectedStyle="\APASixthEditionOfficeOnline.xsl" StyleName="APA" Version="6"/>
+<file path=customXml/itemProps1.xml><?xml version="1.0" encoding="utf-8"?>
+<ds:datastoreItem xmlns:ds="http://schemas.openxmlformats.org/officeDocument/2006/customXml" ds:itemID="{24C3C1E6-D33C-4654-A155-CEA9C3B3FB6A}">
+  <ds:schemaRefs>
+    <ds:schemaRef ds:uri="http://schemas.openxmlformats.org/officeDocument/2006/bibliography"/>
+  </ds:schemaRefs>
+</ds:datastoreItem>
 </file>
 
-<file path=customXml/itemProps1.xml><?xml version="1.0" encoding="utf-8"?>
+<file path=customXml/itemProps2.xml><?xml version="1.0" encoding="utf-8"?>
 <ds:datastoreItem xmlns:ds="http://schemas.openxmlformats.org/officeDocument/2006/customXml" ds:itemID="{11111111-1234-1234-1234-123412341234}">
   <ds:schemaRefs>
     <ds:schemaRef ds:uri="http://customooxmlschemas.google.com/"/>
     <ds:schemaRef ds:uri="http://schemas.openxmlformats.org/officeDocument/2006/relationships"/>
   </ds:schemaRefs>
 </ds:datastoreItem>
-</file>
-
-<file path=customXml/itemProps2.xml><?xml version="1.0" encoding="utf-8"?>
-<ds:datastoreItem xmlns:ds="http://schemas.openxmlformats.org/officeDocument/2006/customXml" ds:itemID="{24C3C1E6-D33C-4654-A155-CEA9C3B3FB6A}">
-  <ds:schemaRefs>
-    <ds:schemaRef ds:uri="http://schemas.openxmlformats.org/officeDocument/2006/bibliography"/>
-  </ds:schemaRefs>
-</ds:datastoreItem>
 </file>
</xml_diff>